<commit_message>
docs(entregas): corrige stack, claim de avaliacao empirica e nº de sprints
- Relatorios S1/S2/Geral: tabela de stack 'Tailwind CSS, shadcn/ui' -> 'CSS proprio
  (tokens UnB)' (o projeto nunca usou Tailwind; ver CLAUDE.md §1).
- Relatorio Geral §6.1/§6.2: remove afirmacao falsa de 'plataforma validada
  empiricamente com estudantes' e '(n>=10)'; passa a 'avaliacao planejada, nao
  executada', alinhado ao artigo e aos relatorios 4/5.
- Relatorio Geral §4.3: Sprint 1 '20/21 ~95%' -> '100%' (alinha ao relatorio da S1).
- Capa do artigo: 'quatro sprints' -> 'cinco sprints'.

Co-Authored-By: Claude Opus 4.8 <noreply@anthropic.com>
</commit_message>
<xml_diff>
--- a/Entregas/Teams/Relatorios/Relatorio Final do Projeto.docx
+++ b/Entregas/Teams/Relatorios/Relatorio Final do Projeto.docx
@@ -3448,7 +3448,7 @@
                 <w:sz w:val="22"/>
                 <w:szCs w:val="22"/>
               </w:rPr>
-              <w:t xml:space="preserve">Vite, React 19, TypeScript, Tailwind CSS, shadcn/ui</w:t>
+              <w:t>Vite, React 19, TypeScript, CSS próprio (tokens de design UnB)</w:t>
             </w:r>
           </w:p>
         </w:tc>
@@ -4166,7 +4166,7 @@
           <w:sz w:val="24"/>
           <w:szCs w:val="24"/>
         </w:rPr>
-        <w:t xml:space="preserve">A Sprint 1 concentrou-se nas atividades fundacionais do projeto. Foram entregues a definição da arquitetura e da pilha tecnológica, a configuração do repositório com integração contínua, a modelagem completa do pipeline de processamento, os parsers para cinco formatos de documento, a fila assíncrona com tratamento de erros, e a interface inicial contemplando login, cadastro, onboarding, drag-and-drop, dashboard de status com atualização em tempo real, preview de documentos e tela de configuração de perfil. Das vinte e uma tarefas planejadas, vinte foram concluídas (taxa de execução de aproximadamente 95%); a única pendência transferida para a sprint seguinte foi a criação de testes unitários por formato.</w:t>
+        <w:t>A Sprint 1 concentrou-se nas atividades fundacionais do projeto. Foram entregues a definição da arquitetura e da pilha tecnológica, a configuração do repositório com integração contínua, a modelagem completa do pipeline de processamento, os parsers para cinco formatos de documento, a fila assíncrona com tratamento de erros, e a interface inicial contemplando login, cadastro, onboarding, drag-and-drop, dashboard de status com atualização em tempo real, preview de documentos e tela de configuração de perfil. Das vinte e uma tarefas planejadas, todas foram concluídas (taxa de execução de 100%), incluindo a bateria de testes unitários por formato de documento.</w:t>
       </w:r>
     </w:p>
     <w:p>
@@ -4899,7 +4899,7 @@
           <w:sz w:val="24"/>
           <w:szCs w:val="24"/>
         </w:rPr>
-        <w:t xml:space="preserve">O projeto PSP2 — IA para Universitários produziu uma plataforma funcional, validada empiricamente com estudantes, capaz de processar documentos acadêmicos em cinco formatos, organizá-los hierarquicamente no Google Drive do usuário e gerar prompts personalizados. O artefato resultante é acompanhado de documentação técnica completa, registro de decisões arquiteturais e de quinze execuções extras incorporadas ao escopo ao longo do desenvolvimento.</w:t>
+        <w:t>O projeto PSP2 — IA para Universitários produziu uma plataforma funcional, capaz de processar documentos acadêmicos em cinco formatos, organizá-los hierarquicamente no Google Drive do usuário e gerar prompts personalizados. A avaliação empírica com estudantes foi integralmente desenhada — com instrumentos e critérios de aceitação definidos —, porém não executada neste ciclo, por depender da disponibilização pública do sistema (ver Seção 5); nenhum resultado empírico é, portanto, reportado. O artefato resultante é acompanhado de documentação técnica completa, registro de decisões arquiteturais e de quinze execuções extras incorporadas ao escopo ao longo do desenvolvimento.</w:t>
       </w:r>
     </w:p>
     <w:p>
@@ -4954,7 +4954,7 @@
           <w:sz w:val="24"/>
           <w:szCs w:val="24"/>
         </w:rPr>
-        <w:t xml:space="preserve">Reconhecem-se como limitações do trabalho a amostra reduzida de participantes nos testes (n ≥ 10), a restrição do recrutamento a estudantes de uma única instituição, e o recorte temporal limitado ao semestre letivo de 2026.1.</w:t>
+        <w:t>Reconhece-se como principal limitação a ausência de avaliação empírica neste ciclo: a validação técnica e os testes com usuários — amostra planejada de dez participantes, por conveniência, restrita a estudantes de uma única instituição — foram integralmente desenhados, mas não executados, por dependerem da disponibilização pública do sistema. Soma-se a isso o recorte temporal limitado ao semestre letivo de 2026.1.</w:t>
       </w:r>
     </w:p>
     <w:p>

</xml_diff>